<commit_message>
Update PROJECT_REPORT.docx: replace legacy terminal screenshots with modern web studio screenshots
</commit_message>
<xml_diff>
--- a/PROJECT_REPORT.docx
+++ b/PROJECT_REPORT.docx
@@ -1647,7 +1647,7 @@
           <w:color w:val="1E293B"/>
           <w:sz w:val="23"/>
         </w:rPr>
-        <w:t>The following screenshots document the actual runtime execution of the Static Code Analyzer in the Windows PowerShell environment, demonstrating interactive code input, accuracy evaluation, function metrics calculation, and diagnostic reports.</w:t>
+        <w:t>The following screenshots document the actual runtime execution of the CodeAccuracy Static Code Analyzer Web Studio (React/Vite frontend and FastAPI compiler engine), demonstrating interactive code diagnostics, the live quality scoring dashboard, the deterministic finite automaton (DFA) token stream, and the scoped symbol table hierarchy.</w:t>
       </w:r>
     </w:p>
     <w:p>
@@ -1658,7 +1658,7 @@
       <w:r>
         <w:drawing>
           <wp:inline xmlns:a="http://schemas.openxmlformats.org/drawingml/2006/main" xmlns:pic="http://schemas.openxmlformats.org/drawingml/2006/picture">
-            <wp:extent cx="5303520" cy="3293983"/>
+            <wp:extent cx="5303520" cy="2672475"/>
             <wp:docPr id="6" name="Picture 6"/>
             <wp:cNvGraphicFramePr>
               <a:graphicFrameLocks noChangeAspect="1"/>
@@ -1679,7 +1679,7 @@
                   <pic:spPr>
                     <a:xfrm>
                       <a:off x="0" y="0"/>
-                      <a:ext cx="5303520" cy="3293983"/>
+                      <a:ext cx="5303520" cy="2672475"/>
                     </a:xfrm>
                     <a:prstGeom prst="rect"/>
                   </pic:spPr>
@@ -1702,7 +1702,7 @@
           <w:color w:val="475569"/>
           <w:sz w:val="20"/>
         </w:rPr>
-        <w:t>Figure 8.1: Live Terminal Execution - Interactive C++ Code Input via PowerShell Pipeline</w:t>
+        <w:t>Figure 8.1: CodeAccuracy Web Studio - Comprehensive Metrics &amp; Quality Assessment Dashboard</w:t>
       </w:r>
     </w:p>
     <w:p>
@@ -1715,7 +1715,7 @@
           <w:color w:val="1E293B"/>
           <w:sz w:val="23"/>
         </w:rPr>
-        <w:t>Figure 8.1 illustrates the interactive input mechanism. The user pipes C++ source code directly into the analyzer executable. The program reads the multi-line input buffer and passes it into the compiler front-end pipeline without requiring a physical file.</w:t>
+        <w:t>Figure 8.1 demonstrates the primary analytical overview of the static code analyzer web studio. The circular accuracy gauge confirms a 100.0% Accuracy Score (Grade A+), accompanied by real-time Key Performance Indicators (KPIs) showing zero violations, an average McCabe Cyclomatic Complexity of 1.8 (Low Risk), 5 analyzed functions, and 42 physical lines of code. The lower panel visualizes the distribution of issues by severity and presents a comparative bar chart of cyclomatic complexity across individual functions.</w:t>
       </w:r>
     </w:p>
     <w:p>
@@ -1726,7 +1726,7 @@
       <w:r>
         <w:drawing>
           <wp:inline xmlns:a="http://schemas.openxmlformats.org/drawingml/2006/main" xmlns:pic="http://schemas.openxmlformats.org/drawingml/2006/picture">
-            <wp:extent cx="5303520" cy="1900773"/>
+            <wp:extent cx="5303520" cy="2459740"/>
             <wp:docPr id="7" name="Picture 7"/>
             <wp:cNvGraphicFramePr>
               <a:graphicFrameLocks noChangeAspect="1"/>
@@ -1747,7 +1747,7 @@
                   <pic:spPr>
                     <a:xfrm>
                       <a:off x="0" y="0"/>
-                      <a:ext cx="5303520" cy="1900773"/>
+                      <a:ext cx="5303520" cy="2459740"/>
                     </a:xfrm>
                     <a:prstGeom prst="rect"/>
                   </pic:spPr>
@@ -1770,7 +1770,7 @@
           <w:color w:val="475569"/>
           <w:sz w:val="20"/>
         </w:rPr>
-        <w:t>Figure 8.2: Static Code Analyzer &amp; Accuracy Report Header (100% Accuracy Score, Grade A+)</w:t>
+        <w:t>Figure 8.2: Deterministic Finite Automaton (DFA) Lexical Token Stream Analysis</w:t>
       </w:r>
     </w:p>
     <w:p>
@@ -1783,7 +1783,7 @@
           <w:color w:val="1E293B"/>
           <w:sz w:val="23"/>
         </w:rPr>
-        <w:t>Figure 8.2 demonstrates the Accuracy &amp; Quality Assessment output for clean code. The system evaluated the input code, awarded a 100.0% Accuracy Score (Grade A+), and confirmed zero syntax, semantic, or structural violations.</w:t>
+        <w:t>Figure 8.2 illustrates the interactive token analysis panel generated by the hand-written DFA tokenizer. The table enumerates the complete stream of 163 tokens extracted from the C++ source code, displaying the exact 1-indexed line and column coordinates, color-coded token classifications (Comments, Keywords, Identifiers, Delimiters, Operators), and corresponding lexeme values.</w:t>
       </w:r>
     </w:p>
     <w:p>
@@ -1794,7 +1794,7 @@
       <w:r>
         <w:drawing>
           <wp:inline xmlns:a="http://schemas.openxmlformats.org/drawingml/2006/main" xmlns:pic="http://schemas.openxmlformats.org/drawingml/2006/picture">
-            <wp:extent cx="5303520" cy="2351365"/>
+            <wp:extent cx="5303520" cy="2278850"/>
             <wp:docPr id="8" name="Picture 8"/>
             <wp:cNvGraphicFramePr>
               <a:graphicFrameLocks noChangeAspect="1"/>
@@ -1815,7 +1815,7 @@
                   <pic:spPr>
                     <a:xfrm>
                       <a:off x="0" y="0"/>
-                      <a:ext cx="5303520" cy="2351365"/>
+                      <a:ext cx="5303520" cy="2278850"/>
                     </a:xfrm>
                     <a:prstGeom prst="rect"/>
                   </pic:spPr>
@@ -1838,7 +1838,7 @@
           <w:color w:val="475569"/>
           <w:sz w:val="20"/>
         </w:rPr>
-        <w:t>Figure 8.3: Function Metrics Table, McCabe Cyclomatic Complexity, and Final Passed Status</w:t>
+        <w:t>Figure 8.3: Multi-Level Scoped Symbol Table and Identifier Tracking</w:t>
       </w:r>
     </w:p>
     <w:p>
@@ -1851,7 +1851,7 @@
           <w:color w:val="1E293B"/>
           <w:sz w:val="23"/>
         </w:rPr>
-        <w:t>Figure 8.3 shows the per-function complexity metrics table. Each function's line span, LOC, maximum control flow nesting depth, McCabe cyclomatic complexity, and risk level are tabulated, followed by the final clean pass status.</w:t>
+        <w:t>Figure 8.3 shows the scoped symbol table inspector generated during AST semantic traversal. It tabulates all 18 identifiers declared in the program, tracking their data types (int, void, etc.), hierarchical lexical scope levels (global, function-local, loop-local), and their precise declaration line numbers, ensuring robust detection of variable shadowing, undeclared usages, and unreferenced memory.</w:t>
       </w:r>
     </w:p>
     <w:p>

</xml_diff>